<commit_message>
Final version of lab 3
</commit_message>
<xml_diff>
--- a/IGI/LR3/igi_lr3.docx
+++ b/IGI/LR3/igi_lr3.docx
@@ -142,6 +142,66 @@
         <w:spacing w:after="0" w:line="240" w:lineRule="auto"/>
         <w:rPr>
           <w:rFonts w:ascii="Times New Roman" w:hAnsi="Times New Roman" w:cs="Times New Roman"/>
+          <w:lang w:val="en-US"/>
+        </w:rPr>
+      </w:pPr>
+    </w:p>
+    <w:p>
+      <w:pPr>
+        <w:spacing w:after="0" w:line="240" w:lineRule="auto"/>
+        <w:jc w:val="center"/>
+        <w:rPr>
+          <w:rFonts w:ascii="Times New Roman" w:hAnsi="Times New Roman" w:cs="Times New Roman"/>
+          <w:lang w:val="en-US"/>
+        </w:rPr>
+      </w:pPr>
+      <w:r>
+        <w:rPr>
+          <w:rFonts w:ascii="Times New Roman" w:hAnsi="Times New Roman" w:cs="Times New Roman"/>
+          <w:lang w:val="ru-RU"/>
+        </w:rPr>
+        <w:drawing>
+          <wp:inline distT="0" distB="0" distL="0" distR="0" wp14:anchorId="677C9345" wp14:editId="584E91E1">
+            <wp:extent cx="4457700" cy="4152261"/>
+            <wp:effectExtent l="0" t="0" r="0" b="1270"/>
+            <wp:docPr id="66023124" name="Рисунок 1"/>
+            <wp:cNvGraphicFramePr>
+              <a:graphicFrameLocks xmlns:a="http://schemas.openxmlformats.org/drawingml/2006/main" noChangeAspect="1"/>
+            </wp:cNvGraphicFramePr>
+            <a:graphic xmlns:a="http://schemas.openxmlformats.org/drawingml/2006/main">
+              <a:graphicData uri="http://schemas.openxmlformats.org/drawingml/2006/picture">
+                <pic:pic xmlns:pic="http://schemas.openxmlformats.org/drawingml/2006/picture">
+                  <pic:nvPicPr>
+                    <pic:cNvPr id="66023124" name=""/>
+                    <pic:cNvPicPr/>
+                  </pic:nvPicPr>
+                  <pic:blipFill>
+                    <a:blip r:embed="rId5"/>
+                    <a:stretch>
+                      <a:fillRect/>
+                    </a:stretch>
+                  </pic:blipFill>
+                  <pic:spPr>
+                    <a:xfrm>
+                      <a:off x="0" y="0"/>
+                      <a:ext cx="4470059" cy="4163773"/>
+                    </a:xfrm>
+                    <a:prstGeom prst="rect">
+                      <a:avLst/>
+                    </a:prstGeom>
+                  </pic:spPr>
+                </pic:pic>
+              </a:graphicData>
+            </a:graphic>
+          </wp:inline>
+        </w:drawing>
+      </w:r>
+    </w:p>
+    <w:p>
+      <w:pPr>
+        <w:spacing w:after="0" w:line="240" w:lineRule="auto"/>
+        <w:rPr>
+          <w:rFonts w:ascii="Times New Roman" w:hAnsi="Times New Roman" w:cs="Times New Roman"/>
           <w:lang w:val="ru-RU"/>
         </w:rPr>
       </w:pPr>
@@ -167,23 +227,7 @@
           <w:rFonts w:ascii="Times New Roman" w:hAnsi="Times New Roman" w:cs="Times New Roman"/>
           <w:lang w:val="ru-RU"/>
         </w:rPr>
-        <w:t xml:space="preserve"> В соответствии с заданием своего варианта составить программу для вычисления значения функции c помощью разложения функции в степенной ряд. Задать точность вычислений </w:t>
-      </w:r>
-      <w:proofErr w:type="spellStart"/>
-      <w:r>
-        <w:rPr>
-          <w:rFonts w:ascii="Times New Roman" w:hAnsi="Times New Roman" w:cs="Times New Roman"/>
-          <w:lang w:val="ru-RU"/>
-        </w:rPr>
-        <w:t>eps</w:t>
-      </w:r>
-      <w:proofErr w:type="spellEnd"/>
-      <w:r>
-        <w:rPr>
-          <w:rFonts w:ascii="Times New Roman" w:hAnsi="Times New Roman" w:cs="Times New Roman"/>
-          <w:lang w:val="ru-RU"/>
-        </w:rPr>
-        <w:t xml:space="preserve">. </w:t>
+        <w:t xml:space="preserve"> В соответствии с заданием своего варианта составить программу для вычисления значения функции c помощью разложения функции в степенной ряд. Задать точность вычислений eps. </w:t>
       </w:r>
     </w:p>
     <w:p>
@@ -229,6 +273,7 @@
       <w:r>
         <w:rPr>
           <w:rFonts w:ascii="Times New Roman" w:hAnsi="Times New Roman" w:cs="Times New Roman"/>
+          <w:noProof/>
           <w:lang w:val="ru-RU"/>
         </w:rPr>
         <w:drawing>
@@ -247,7 +292,7 @@
                     <pic:cNvPicPr/>
                   </pic:nvPicPr>
                   <pic:blipFill>
-                    <a:blip r:embed="rId4"/>
+                    <a:blip r:embed="rId6"/>
                     <a:stretch>
                       <a:fillRect/>
                     </a:stretch>
@@ -281,61 +326,30 @@
           <w:rFonts w:ascii="Times New Roman" w:hAnsi="Times New Roman" w:cs="Times New Roman"/>
           <w:lang w:val="ru-RU"/>
         </w:rPr>
-        <w:t xml:space="preserve">Здесь x – значение аргумента, F(x) – значение функции, n – количество просуммированных членов ряда, </w:t>
-      </w:r>
-      <w:proofErr w:type="spellStart"/>
-      <w:r>
-        <w:rPr>
-          <w:rFonts w:ascii="Times New Roman" w:hAnsi="Times New Roman" w:cs="Times New Roman"/>
-          <w:lang w:val="ru-RU"/>
-        </w:rPr>
-        <w:t>Math</w:t>
-      </w:r>
-      <w:proofErr w:type="spellEnd"/>
-      <w:r>
-        <w:rPr>
-          <w:rFonts w:ascii="Times New Roman" w:hAnsi="Times New Roman" w:cs="Times New Roman"/>
-          <w:lang w:val="ru-RU"/>
-        </w:rPr>
-        <w:t xml:space="preserve"> F(x) – значение функции, вычисленное с помощью модуля </w:t>
-      </w:r>
-      <w:proofErr w:type="spellStart"/>
-      <w:r>
-        <w:rPr>
-          <w:rFonts w:ascii="Times New Roman" w:hAnsi="Times New Roman" w:cs="Times New Roman"/>
-          <w:lang w:val="ru-RU"/>
-        </w:rPr>
-        <w:t>math</w:t>
-      </w:r>
-      <w:proofErr w:type="spellEnd"/>
-      <w:r>
-        <w:rPr>
-          <w:rFonts w:ascii="Times New Roman" w:hAnsi="Times New Roman" w:cs="Times New Roman"/>
-          <w:lang w:val="ru-RU"/>
-        </w:rPr>
-        <w:t>.</w:t>
-      </w:r>
-    </w:p>
-    <w:p>
-      <w:pPr>
-        <w:spacing w:after="0" w:line="240" w:lineRule="auto"/>
-        <w:rPr>
-          <w:rFonts w:ascii="Times New Roman" w:hAnsi="Times New Roman" w:cs="Times New Roman"/>
-          <w:lang w:val="ru-RU"/>
-        </w:rPr>
-      </w:pPr>
-    </w:p>
-    <w:p>
-      <w:pPr>
-        <w:spacing w:after="0" w:line="240" w:lineRule="auto"/>
-        <w:rPr>
-          <w:rFonts w:ascii="Times New Roman" w:hAnsi="Times New Roman" w:cs="Times New Roman"/>
-          <w:lang w:val="en-US"/>
-        </w:rPr>
-      </w:pPr>
-      <w:r>
-        <w:rPr>
-          <w:rFonts w:ascii="Times New Roman" w:hAnsi="Times New Roman" w:cs="Times New Roman"/>
+        <w:t>Здесь x – значение аргумента, F(x) – значение функции, n – количество просуммированных членов ряда, Math F(x) – значение функции, вычисленное с помощью модуля math.</w:t>
+      </w:r>
+    </w:p>
+    <w:p>
+      <w:pPr>
+        <w:spacing w:after="0" w:line="240" w:lineRule="auto"/>
+        <w:rPr>
+          <w:rFonts w:ascii="Times New Roman" w:hAnsi="Times New Roman" w:cs="Times New Roman"/>
+          <w:lang w:val="ru-RU"/>
+        </w:rPr>
+      </w:pPr>
+    </w:p>
+    <w:p>
+      <w:pPr>
+        <w:spacing w:after="0" w:line="240" w:lineRule="auto"/>
+        <w:rPr>
+          <w:rFonts w:ascii="Times New Roman" w:hAnsi="Times New Roman" w:cs="Times New Roman"/>
+          <w:lang w:val="ru-RU"/>
+        </w:rPr>
+      </w:pPr>
+      <w:r>
+        <w:rPr>
+          <w:rFonts w:ascii="Times New Roman" w:hAnsi="Times New Roman" w:cs="Times New Roman"/>
+          <w:noProof/>
           <w:lang w:val="ru-RU"/>
         </w:rPr>
         <w:drawing>
@@ -354,7 +368,7 @@
                     <pic:cNvPicPr/>
                   </pic:nvPicPr>
                   <pic:blipFill rotWithShape="1">
-                    <a:blip r:embed="rId5"/>
+                    <a:blip r:embed="rId7"/>
                     <a:srcRect l="646" t="10979" r="1266" b="8666"/>
                     <a:stretch>
                       <a:fillRect/>
@@ -389,6 +403,261 @@
         <w:spacing w:after="0" w:line="240" w:lineRule="auto"/>
         <w:rPr>
           <w:rFonts w:ascii="Times New Roman" w:hAnsi="Times New Roman" w:cs="Times New Roman"/>
+          <w:lang w:val="ru-RU"/>
+        </w:rPr>
+      </w:pPr>
+    </w:p>
+    <w:p>
+      <w:pPr>
+        <w:spacing w:after="0" w:line="240" w:lineRule="auto"/>
+        <w:rPr>
+          <w:rFonts w:ascii="Times New Roman" w:hAnsi="Times New Roman" w:cs="Times New Roman"/>
+          <w:lang w:val="ru-RU"/>
+        </w:rPr>
+      </w:pPr>
+    </w:p>
+    <w:p>
+      <w:pPr>
+        <w:spacing w:after="0" w:line="240" w:lineRule="auto"/>
+        <w:jc w:val="center"/>
+        <w:rPr>
+          <w:rFonts w:ascii="Times New Roman" w:hAnsi="Times New Roman" w:cs="Times New Roman"/>
+          <w:lang w:val="ru-RU"/>
+        </w:rPr>
+      </w:pPr>
+      <w:r>
+        <w:rPr>
+          <w:rFonts w:ascii="Times New Roman" w:hAnsi="Times New Roman" w:cs="Times New Roman"/>
+          <w:noProof/>
+          <w:lang w:val="ru-RU"/>
+        </w:rPr>
+        <w:drawing>
+          <wp:inline distT="0" distB="0" distL="0" distR="0" wp14:anchorId="3ED48185" wp14:editId="73521A0C">
+            <wp:extent cx="5940425" cy="4424045"/>
+            <wp:effectExtent l="0" t="0" r="3175" b="0"/>
+            <wp:docPr id="1391827046" name="Рисунок 1"/>
+            <wp:cNvGraphicFramePr>
+              <a:graphicFrameLocks xmlns:a="http://schemas.openxmlformats.org/drawingml/2006/main" noChangeAspect="1"/>
+            </wp:cNvGraphicFramePr>
+            <a:graphic xmlns:a="http://schemas.openxmlformats.org/drawingml/2006/main">
+              <a:graphicData uri="http://schemas.openxmlformats.org/drawingml/2006/picture">
+                <pic:pic xmlns:pic="http://schemas.openxmlformats.org/drawingml/2006/picture">
+                  <pic:nvPicPr>
+                    <pic:cNvPr id="1391827046" name=""/>
+                    <pic:cNvPicPr/>
+                  </pic:nvPicPr>
+                  <pic:blipFill>
+                    <a:blip r:embed="rId8"/>
+                    <a:stretch>
+                      <a:fillRect/>
+                    </a:stretch>
+                  </pic:blipFill>
+                  <pic:spPr>
+                    <a:xfrm>
+                      <a:off x="0" y="0"/>
+                      <a:ext cx="5940425" cy="4424045"/>
+                    </a:xfrm>
+                    <a:prstGeom prst="rect">
+                      <a:avLst/>
+                    </a:prstGeom>
+                  </pic:spPr>
+                </pic:pic>
+              </a:graphicData>
+            </a:graphic>
+          </wp:inline>
+        </w:drawing>
+      </w:r>
+    </w:p>
+    <w:p>
+      <w:pPr>
+        <w:spacing w:after="0" w:line="240" w:lineRule="auto"/>
+        <w:rPr>
+          <w:rFonts w:ascii="Times New Roman" w:hAnsi="Times New Roman" w:cs="Times New Roman"/>
+          <w:lang w:val="ru-RU"/>
+        </w:rPr>
+      </w:pPr>
+    </w:p>
+    <w:p>
+      <w:pPr>
+        <w:spacing w:after="0" w:line="240" w:lineRule="auto"/>
+        <w:jc w:val="center"/>
+        <w:rPr>
+          <w:rFonts w:ascii="Times New Roman" w:hAnsi="Times New Roman" w:cs="Times New Roman"/>
+          <w:lang w:val="ru-RU"/>
+        </w:rPr>
+      </w:pPr>
+      <w:r>
+        <w:rPr>
+          <w:rFonts w:ascii="Times New Roman" w:hAnsi="Times New Roman" w:cs="Times New Roman"/>
+          <w:noProof/>
+          <w:lang w:val="ru-RU"/>
+        </w:rPr>
+        <w:drawing>
+          <wp:inline distT="0" distB="0" distL="0" distR="0" wp14:anchorId="7406A0B8" wp14:editId="130EF1D7">
+            <wp:extent cx="5940425" cy="4068445"/>
+            <wp:effectExtent l="0" t="0" r="3175" b="8255"/>
+            <wp:docPr id="353918823" name="Рисунок 1"/>
+            <wp:cNvGraphicFramePr>
+              <a:graphicFrameLocks xmlns:a="http://schemas.openxmlformats.org/drawingml/2006/main" noChangeAspect="1"/>
+            </wp:cNvGraphicFramePr>
+            <a:graphic xmlns:a="http://schemas.openxmlformats.org/drawingml/2006/main">
+              <a:graphicData uri="http://schemas.openxmlformats.org/drawingml/2006/picture">
+                <pic:pic xmlns:pic="http://schemas.openxmlformats.org/drawingml/2006/picture">
+                  <pic:nvPicPr>
+                    <pic:cNvPr id="353918823" name=""/>
+                    <pic:cNvPicPr/>
+                  </pic:nvPicPr>
+                  <pic:blipFill>
+                    <a:blip r:embed="rId9"/>
+                    <a:stretch>
+                      <a:fillRect/>
+                    </a:stretch>
+                  </pic:blipFill>
+                  <pic:spPr>
+                    <a:xfrm>
+                      <a:off x="0" y="0"/>
+                      <a:ext cx="5940425" cy="4068445"/>
+                    </a:xfrm>
+                    <a:prstGeom prst="rect">
+                      <a:avLst/>
+                    </a:prstGeom>
+                  </pic:spPr>
+                </pic:pic>
+              </a:graphicData>
+            </a:graphic>
+          </wp:inline>
+        </w:drawing>
+      </w:r>
+    </w:p>
+    <w:p>
+      <w:pPr>
+        <w:spacing w:after="0" w:line="240" w:lineRule="auto"/>
+        <w:rPr>
+          <w:rFonts w:ascii="Times New Roman" w:hAnsi="Times New Roman" w:cs="Times New Roman"/>
+          <w:lang w:val="ru-RU"/>
+        </w:rPr>
+      </w:pPr>
+    </w:p>
+    <w:p>
+      <w:pPr>
+        <w:spacing w:after="0" w:line="240" w:lineRule="auto"/>
+        <w:jc w:val="center"/>
+        <w:rPr>
+          <w:rFonts w:ascii="Times New Roman" w:hAnsi="Times New Roman" w:cs="Times New Roman"/>
+          <w:lang w:val="ru-RU"/>
+        </w:rPr>
+      </w:pPr>
+      <w:r>
+        <w:rPr>
+          <w:rFonts w:ascii="Times New Roman" w:hAnsi="Times New Roman" w:cs="Times New Roman"/>
+          <w:noProof/>
+          <w:lang w:val="ru-RU"/>
+        </w:rPr>
+        <w:lastRenderedPageBreak/>
+        <w:drawing>
+          <wp:inline distT="0" distB="0" distL="0" distR="0" wp14:anchorId="3A32F105" wp14:editId="1E925228">
+            <wp:extent cx="5943177" cy="4114800"/>
+            <wp:effectExtent l="0" t="0" r="635" b="0"/>
+            <wp:docPr id="948758972" name="Рисунок 1"/>
+            <wp:cNvGraphicFramePr>
+              <a:graphicFrameLocks xmlns:a="http://schemas.openxmlformats.org/drawingml/2006/main" noChangeAspect="1"/>
+            </wp:cNvGraphicFramePr>
+            <a:graphic xmlns:a="http://schemas.openxmlformats.org/drawingml/2006/main">
+              <a:graphicData uri="http://schemas.openxmlformats.org/drawingml/2006/picture">
+                <pic:pic xmlns:pic="http://schemas.openxmlformats.org/drawingml/2006/picture">
+                  <pic:nvPicPr>
+                    <pic:cNvPr id="948758972" name=""/>
+                    <pic:cNvPicPr/>
+                  </pic:nvPicPr>
+                  <pic:blipFill>
+                    <a:blip r:embed="rId10"/>
+                    <a:stretch>
+                      <a:fillRect/>
+                    </a:stretch>
+                  </pic:blipFill>
+                  <pic:spPr>
+                    <a:xfrm>
+                      <a:off x="0" y="0"/>
+                      <a:ext cx="5973139" cy="4135544"/>
+                    </a:xfrm>
+                    <a:prstGeom prst="rect">
+                      <a:avLst/>
+                    </a:prstGeom>
+                  </pic:spPr>
+                </pic:pic>
+              </a:graphicData>
+            </a:graphic>
+          </wp:inline>
+        </w:drawing>
+      </w:r>
+    </w:p>
+    <w:p>
+      <w:pPr>
+        <w:spacing w:after="0" w:line="240" w:lineRule="auto"/>
+        <w:jc w:val="center"/>
+        <w:rPr>
+          <w:rFonts w:ascii="Times New Roman" w:hAnsi="Times New Roman" w:cs="Times New Roman"/>
+          <w:lang w:val="ru-RU"/>
+        </w:rPr>
+      </w:pPr>
+    </w:p>
+    <w:p>
+      <w:pPr>
+        <w:spacing w:after="0" w:line="240" w:lineRule="auto"/>
+        <w:jc w:val="center"/>
+        <w:rPr>
+          <w:rFonts w:ascii="Times New Roman" w:hAnsi="Times New Roman" w:cs="Times New Roman"/>
+          <w:lang w:val="en-US"/>
+        </w:rPr>
+      </w:pPr>
+      <w:r>
+        <w:rPr>
+          <w:rFonts w:ascii="Times New Roman" w:hAnsi="Times New Roman" w:cs="Times New Roman"/>
+          <w:noProof/>
+          <w:lang w:val="ru-RU"/>
+        </w:rPr>
+        <w:drawing>
+          <wp:inline distT="0" distB="0" distL="0" distR="0" wp14:anchorId="2DD8DC22" wp14:editId="7F4D1CDF">
+            <wp:extent cx="5031707" cy="4614863"/>
+            <wp:effectExtent l="0" t="0" r="0" b="0"/>
+            <wp:docPr id="1643127055" name="Рисунок 1"/>
+            <wp:cNvGraphicFramePr>
+              <a:graphicFrameLocks xmlns:a="http://schemas.openxmlformats.org/drawingml/2006/main" noChangeAspect="1"/>
+            </wp:cNvGraphicFramePr>
+            <a:graphic xmlns:a="http://schemas.openxmlformats.org/drawingml/2006/main">
+              <a:graphicData uri="http://schemas.openxmlformats.org/drawingml/2006/picture">
+                <pic:pic xmlns:pic="http://schemas.openxmlformats.org/drawingml/2006/picture">
+                  <pic:nvPicPr>
+                    <pic:cNvPr id="1643127055" name=""/>
+                    <pic:cNvPicPr/>
+                  </pic:nvPicPr>
+                  <pic:blipFill>
+                    <a:blip r:embed="rId11"/>
+                    <a:stretch>
+                      <a:fillRect/>
+                    </a:stretch>
+                  </pic:blipFill>
+                  <pic:spPr>
+                    <a:xfrm>
+                      <a:off x="0" y="0"/>
+                      <a:ext cx="5042306" cy="4624584"/>
+                    </a:xfrm>
+                    <a:prstGeom prst="rect">
+                      <a:avLst/>
+                    </a:prstGeom>
+                  </pic:spPr>
+                </pic:pic>
+              </a:graphicData>
+            </a:graphic>
+          </wp:inline>
+        </w:drawing>
+      </w:r>
+    </w:p>
+    <w:p>
+      <w:pPr>
+        <w:spacing w:after="0" w:line="240" w:lineRule="auto"/>
+        <w:rPr>
+          <w:rFonts w:ascii="Times New Roman" w:hAnsi="Times New Roman" w:cs="Times New Roman"/>
           <w:lang w:val="en-US"/>
         </w:rPr>
       </w:pPr>
@@ -407,6 +676,7 @@
           <w:b/>
           <w:lang w:val="ru-RU"/>
         </w:rPr>
+        <w:lastRenderedPageBreak/>
         <w:t>Задание 2.</w:t>
       </w:r>
       <w:r>
@@ -422,12 +692,13 @@
         <w:spacing w:after="0" w:line="240" w:lineRule="auto"/>
         <w:rPr>
           <w:rFonts w:ascii="Times New Roman" w:hAnsi="Times New Roman" w:cs="Times New Roman"/>
-          <w:lang w:val="en-US"/>
-        </w:rPr>
-      </w:pPr>
-      <w:r>
-        <w:rPr>
-          <w:rFonts w:ascii="Times New Roman" w:hAnsi="Times New Roman" w:cs="Times New Roman"/>
+          <w:lang w:val="ru-RU"/>
+        </w:rPr>
+      </w:pPr>
+      <w:r>
+        <w:rPr>
+          <w:rFonts w:ascii="Times New Roman" w:hAnsi="Times New Roman" w:cs="Times New Roman"/>
+          <w:noProof/>
           <w:lang w:val="ru-RU"/>
         </w:rPr>
         <w:drawing>
@@ -446,7 +717,7 @@
                     <pic:cNvPicPr/>
                   </pic:nvPicPr>
                   <pic:blipFill rotWithShape="1">
-                    <a:blip r:embed="rId6"/>
+                    <a:blip r:embed="rId12"/>
                     <a:srcRect t="4702" b="5956"/>
                     <a:stretch>
                       <a:fillRect/>
@@ -481,6 +752,187 @@
         <w:spacing w:after="0" w:line="240" w:lineRule="auto"/>
         <w:rPr>
           <w:rFonts w:ascii="Times New Roman" w:hAnsi="Times New Roman" w:cs="Times New Roman"/>
+          <w:lang w:val="ru-RU"/>
+        </w:rPr>
+      </w:pPr>
+    </w:p>
+    <w:p>
+      <w:pPr>
+        <w:spacing w:after="0" w:line="240" w:lineRule="auto"/>
+        <w:rPr>
+          <w:rFonts w:ascii="Times New Roman" w:hAnsi="Times New Roman" w:cs="Times New Roman"/>
+          <w:lang w:val="ru-RU"/>
+        </w:rPr>
+      </w:pPr>
+      <w:r>
+        <w:rPr>
+          <w:rFonts w:ascii="Times New Roman" w:hAnsi="Times New Roman" w:cs="Times New Roman"/>
+          <w:noProof/>
+          <w:lang w:val="ru-RU"/>
+        </w:rPr>
+        <w:drawing>
+          <wp:inline distT="0" distB="0" distL="0" distR="0" wp14:anchorId="77405FC0" wp14:editId="0D9F57D3">
+            <wp:extent cx="5940425" cy="2933700"/>
+            <wp:effectExtent l="0" t="0" r="3175" b="0"/>
+            <wp:docPr id="1160141451" name="Рисунок 1"/>
+            <wp:cNvGraphicFramePr>
+              <a:graphicFrameLocks xmlns:a="http://schemas.openxmlformats.org/drawingml/2006/main" noChangeAspect="1"/>
+            </wp:cNvGraphicFramePr>
+            <a:graphic xmlns:a="http://schemas.openxmlformats.org/drawingml/2006/main">
+              <a:graphicData uri="http://schemas.openxmlformats.org/drawingml/2006/picture">
+                <pic:pic xmlns:pic="http://schemas.openxmlformats.org/drawingml/2006/picture">
+                  <pic:nvPicPr>
+                    <pic:cNvPr id="1160141451" name=""/>
+                    <pic:cNvPicPr/>
+                  </pic:nvPicPr>
+                  <pic:blipFill>
+                    <a:blip r:embed="rId13"/>
+                    <a:stretch>
+                      <a:fillRect/>
+                    </a:stretch>
+                  </pic:blipFill>
+                  <pic:spPr>
+                    <a:xfrm>
+                      <a:off x="0" y="0"/>
+                      <a:ext cx="5940425" cy="2933700"/>
+                    </a:xfrm>
+                    <a:prstGeom prst="rect">
+                      <a:avLst/>
+                    </a:prstGeom>
+                  </pic:spPr>
+                </pic:pic>
+              </a:graphicData>
+            </a:graphic>
+          </wp:inline>
+        </w:drawing>
+      </w:r>
+    </w:p>
+    <w:p>
+      <w:pPr>
+        <w:spacing w:after="0" w:line="240" w:lineRule="auto"/>
+        <w:rPr>
+          <w:rFonts w:ascii="Times New Roman" w:hAnsi="Times New Roman" w:cs="Times New Roman"/>
+          <w:lang w:val="ru-RU"/>
+        </w:rPr>
+      </w:pPr>
+    </w:p>
+    <w:p>
+      <w:pPr>
+        <w:spacing w:after="0" w:line="240" w:lineRule="auto"/>
+        <w:rPr>
+          <w:rFonts w:ascii="Times New Roman" w:hAnsi="Times New Roman" w:cs="Times New Roman"/>
+          <w:lang w:val="en-US"/>
+        </w:rPr>
+      </w:pPr>
+      <w:r>
+        <w:rPr>
+          <w:rFonts w:ascii="Times New Roman" w:hAnsi="Times New Roman" w:cs="Times New Roman"/>
+          <w:noProof/>
+          <w:lang w:val="ru-RU"/>
+        </w:rPr>
+        <w:drawing>
+          <wp:inline distT="0" distB="0" distL="0" distR="0" wp14:anchorId="2986536C" wp14:editId="3F974A6F">
+            <wp:extent cx="5940425" cy="2400300"/>
+            <wp:effectExtent l="0" t="0" r="3175" b="0"/>
+            <wp:docPr id="478686804" name="Рисунок 1"/>
+            <wp:cNvGraphicFramePr>
+              <a:graphicFrameLocks xmlns:a="http://schemas.openxmlformats.org/drawingml/2006/main" noChangeAspect="1"/>
+            </wp:cNvGraphicFramePr>
+            <a:graphic xmlns:a="http://schemas.openxmlformats.org/drawingml/2006/main">
+              <a:graphicData uri="http://schemas.openxmlformats.org/drawingml/2006/picture">
+                <pic:pic xmlns:pic="http://schemas.openxmlformats.org/drawingml/2006/picture">
+                  <pic:nvPicPr>
+                    <pic:cNvPr id="478686804" name=""/>
+                    <pic:cNvPicPr/>
+                  </pic:nvPicPr>
+                  <pic:blipFill>
+                    <a:blip r:embed="rId14"/>
+                    <a:stretch>
+                      <a:fillRect/>
+                    </a:stretch>
+                  </pic:blipFill>
+                  <pic:spPr>
+                    <a:xfrm>
+                      <a:off x="0" y="0"/>
+                      <a:ext cx="5940425" cy="2400300"/>
+                    </a:xfrm>
+                    <a:prstGeom prst="rect">
+                      <a:avLst/>
+                    </a:prstGeom>
+                  </pic:spPr>
+                </pic:pic>
+              </a:graphicData>
+            </a:graphic>
+          </wp:inline>
+        </w:drawing>
+      </w:r>
+    </w:p>
+    <w:p>
+      <w:pPr>
+        <w:spacing w:after="0" w:line="240" w:lineRule="auto"/>
+        <w:rPr>
+          <w:rFonts w:ascii="Times New Roman" w:hAnsi="Times New Roman" w:cs="Times New Roman"/>
+          <w:lang w:val="en-US"/>
+        </w:rPr>
+      </w:pPr>
+    </w:p>
+    <w:p>
+      <w:pPr>
+        <w:spacing w:after="0" w:line="240" w:lineRule="auto"/>
+        <w:jc w:val="center"/>
+        <w:rPr>
+          <w:rFonts w:ascii="Times New Roman" w:hAnsi="Times New Roman" w:cs="Times New Roman"/>
+          <w:lang w:val="en-US"/>
+        </w:rPr>
+      </w:pPr>
+      <w:r>
+        <w:rPr>
+          <w:rFonts w:ascii="Times New Roman" w:hAnsi="Times New Roman" w:cs="Times New Roman"/>
+          <w:noProof/>
+          <w:lang w:val="en-US"/>
+        </w:rPr>
+        <w:drawing>
+          <wp:inline distT="0" distB="0" distL="0" distR="0" wp14:anchorId="47FFD5F9" wp14:editId="706DC488">
+            <wp:extent cx="3862290" cy="2419350"/>
+            <wp:effectExtent l="0" t="0" r="5080" b="0"/>
+            <wp:docPr id="787744392" name="Рисунок 1"/>
+            <wp:cNvGraphicFramePr>
+              <a:graphicFrameLocks xmlns:a="http://schemas.openxmlformats.org/drawingml/2006/main" noChangeAspect="1"/>
+            </wp:cNvGraphicFramePr>
+            <a:graphic xmlns:a="http://schemas.openxmlformats.org/drawingml/2006/main">
+              <a:graphicData uri="http://schemas.openxmlformats.org/drawingml/2006/picture">
+                <pic:pic xmlns:pic="http://schemas.openxmlformats.org/drawingml/2006/picture">
+                  <pic:nvPicPr>
+                    <pic:cNvPr id="787744392" name=""/>
+                    <pic:cNvPicPr/>
+                  </pic:nvPicPr>
+                  <pic:blipFill>
+                    <a:blip r:embed="rId15"/>
+                    <a:stretch>
+                      <a:fillRect/>
+                    </a:stretch>
+                  </pic:blipFill>
+                  <pic:spPr>
+                    <a:xfrm>
+                      <a:off x="0" y="0"/>
+                      <a:ext cx="3878216" cy="2429326"/>
+                    </a:xfrm>
+                    <a:prstGeom prst="rect">
+                      <a:avLst/>
+                    </a:prstGeom>
+                  </pic:spPr>
+                </pic:pic>
+              </a:graphicData>
+            </a:graphic>
+          </wp:inline>
+        </w:drawing>
+      </w:r>
+    </w:p>
+    <w:p>
+      <w:pPr>
+        <w:spacing w:after="0" w:line="240" w:lineRule="auto"/>
+        <w:rPr>
+          <w:rFonts w:ascii="Times New Roman" w:hAnsi="Times New Roman" w:cs="Times New Roman"/>
           <w:lang w:val="en-US"/>
         </w:rPr>
       </w:pPr>
@@ -499,6 +951,7 @@
           <w:b/>
           <w:lang w:val="ru-RU"/>
         </w:rPr>
+        <w:lastRenderedPageBreak/>
         <w:t>Задание 3.</w:t>
       </w:r>
       <w:r>
@@ -529,12 +982,13 @@
         <w:spacing w:after="0" w:line="240" w:lineRule="auto"/>
         <w:rPr>
           <w:rFonts w:ascii="Times New Roman" w:hAnsi="Times New Roman" w:cs="Times New Roman"/>
-          <w:lang w:val="en-US"/>
-        </w:rPr>
-      </w:pPr>
-      <w:r>
-        <w:rPr>
-          <w:rFonts w:ascii="Times New Roman" w:hAnsi="Times New Roman" w:cs="Times New Roman"/>
+          <w:lang w:val="ru-RU"/>
+        </w:rPr>
+      </w:pPr>
+      <w:r>
+        <w:rPr>
+          <w:rFonts w:ascii="Times New Roman" w:hAnsi="Times New Roman" w:cs="Times New Roman"/>
+          <w:noProof/>
           <w:lang w:val="en-US"/>
         </w:rPr>
         <w:drawing>
@@ -553,7 +1007,7 @@
                     <pic:cNvPicPr/>
                   </pic:nvPicPr>
                   <pic:blipFill rotWithShape="1">
-                    <a:blip r:embed="rId7"/>
+                    <a:blip r:embed="rId16"/>
                     <a:srcRect t="7283" b="1697"/>
                     <a:stretch>
                       <a:fillRect/>
@@ -588,6 +1042,187 @@
         <w:spacing w:after="0" w:line="240" w:lineRule="auto"/>
         <w:rPr>
           <w:rFonts w:ascii="Times New Roman" w:hAnsi="Times New Roman" w:cs="Times New Roman"/>
+          <w:lang w:val="ru-RU"/>
+        </w:rPr>
+      </w:pPr>
+    </w:p>
+    <w:p>
+      <w:pPr>
+        <w:spacing w:after="0" w:line="240" w:lineRule="auto"/>
+        <w:rPr>
+          <w:rFonts w:ascii="Times New Roman" w:hAnsi="Times New Roman" w:cs="Times New Roman"/>
+          <w:lang w:val="en-US"/>
+        </w:rPr>
+      </w:pPr>
+      <w:r>
+        <w:rPr>
+          <w:rFonts w:ascii="Times New Roman" w:hAnsi="Times New Roman" w:cs="Times New Roman"/>
+          <w:noProof/>
+          <w:lang w:val="ru-RU"/>
+        </w:rPr>
+        <w:drawing>
+          <wp:inline distT="0" distB="0" distL="0" distR="0" wp14:anchorId="01EB8D49" wp14:editId="6377EED9">
+            <wp:extent cx="5940425" cy="989965"/>
+            <wp:effectExtent l="0" t="0" r="3175" b="635"/>
+            <wp:docPr id="1576161326" name="Рисунок 1"/>
+            <wp:cNvGraphicFramePr>
+              <a:graphicFrameLocks xmlns:a="http://schemas.openxmlformats.org/drawingml/2006/main" noChangeAspect="1"/>
+            </wp:cNvGraphicFramePr>
+            <a:graphic xmlns:a="http://schemas.openxmlformats.org/drawingml/2006/main">
+              <a:graphicData uri="http://schemas.openxmlformats.org/drawingml/2006/picture">
+                <pic:pic xmlns:pic="http://schemas.openxmlformats.org/drawingml/2006/picture">
+                  <pic:nvPicPr>
+                    <pic:cNvPr id="1576161326" name=""/>
+                    <pic:cNvPicPr/>
+                  </pic:nvPicPr>
+                  <pic:blipFill>
+                    <a:blip r:embed="rId17"/>
+                    <a:stretch>
+                      <a:fillRect/>
+                    </a:stretch>
+                  </pic:blipFill>
+                  <pic:spPr>
+                    <a:xfrm>
+                      <a:off x="0" y="0"/>
+                      <a:ext cx="5940425" cy="989965"/>
+                    </a:xfrm>
+                    <a:prstGeom prst="rect">
+                      <a:avLst/>
+                    </a:prstGeom>
+                  </pic:spPr>
+                </pic:pic>
+              </a:graphicData>
+            </a:graphic>
+          </wp:inline>
+        </w:drawing>
+      </w:r>
+    </w:p>
+    <w:p>
+      <w:pPr>
+        <w:spacing w:after="0" w:line="240" w:lineRule="auto"/>
+        <w:rPr>
+          <w:rFonts w:ascii="Times New Roman" w:hAnsi="Times New Roman" w:cs="Times New Roman"/>
+          <w:lang w:val="en-US"/>
+        </w:rPr>
+      </w:pPr>
+    </w:p>
+    <w:p>
+      <w:pPr>
+        <w:spacing w:after="0" w:line="240" w:lineRule="auto"/>
+        <w:rPr>
+          <w:rFonts w:ascii="Times New Roman" w:hAnsi="Times New Roman" w:cs="Times New Roman"/>
+          <w:lang w:val="en-US"/>
+        </w:rPr>
+      </w:pPr>
+      <w:r>
+        <w:rPr>
+          <w:rFonts w:ascii="Times New Roman" w:hAnsi="Times New Roman" w:cs="Times New Roman"/>
+          <w:noProof/>
+          <w:lang w:val="ru-RU"/>
+        </w:rPr>
+        <w:drawing>
+          <wp:inline distT="0" distB="0" distL="0" distR="0" wp14:anchorId="26FF7176" wp14:editId="6AA8BB38">
+            <wp:extent cx="5940425" cy="2672080"/>
+            <wp:effectExtent l="0" t="0" r="3175" b="0"/>
+            <wp:docPr id="1720130197" name="Рисунок 1"/>
+            <wp:cNvGraphicFramePr>
+              <a:graphicFrameLocks xmlns:a="http://schemas.openxmlformats.org/drawingml/2006/main" noChangeAspect="1"/>
+            </wp:cNvGraphicFramePr>
+            <a:graphic xmlns:a="http://schemas.openxmlformats.org/drawingml/2006/main">
+              <a:graphicData uri="http://schemas.openxmlformats.org/drawingml/2006/picture">
+                <pic:pic xmlns:pic="http://schemas.openxmlformats.org/drawingml/2006/picture">
+                  <pic:nvPicPr>
+                    <pic:cNvPr id="1720130197" name=""/>
+                    <pic:cNvPicPr/>
+                  </pic:nvPicPr>
+                  <pic:blipFill>
+                    <a:blip r:embed="rId18"/>
+                    <a:stretch>
+                      <a:fillRect/>
+                    </a:stretch>
+                  </pic:blipFill>
+                  <pic:spPr>
+                    <a:xfrm>
+                      <a:off x="0" y="0"/>
+                      <a:ext cx="5940425" cy="2672080"/>
+                    </a:xfrm>
+                    <a:prstGeom prst="rect">
+                      <a:avLst/>
+                    </a:prstGeom>
+                  </pic:spPr>
+                </pic:pic>
+              </a:graphicData>
+            </a:graphic>
+          </wp:inline>
+        </w:drawing>
+      </w:r>
+    </w:p>
+    <w:p>
+      <w:pPr>
+        <w:spacing w:after="0" w:line="240" w:lineRule="auto"/>
+        <w:rPr>
+          <w:rFonts w:ascii="Times New Roman" w:hAnsi="Times New Roman" w:cs="Times New Roman"/>
+          <w:lang w:val="en-US"/>
+        </w:rPr>
+      </w:pPr>
+    </w:p>
+    <w:p>
+      <w:pPr>
+        <w:spacing w:after="0" w:line="240" w:lineRule="auto"/>
+        <w:jc w:val="center"/>
+        <w:rPr>
+          <w:rFonts w:ascii="Times New Roman" w:hAnsi="Times New Roman" w:cs="Times New Roman"/>
+          <w:lang w:val="en-US"/>
+        </w:rPr>
+      </w:pPr>
+      <w:r>
+        <w:rPr>
+          <w:rFonts w:ascii="Times New Roman" w:hAnsi="Times New Roman" w:cs="Times New Roman"/>
+          <w:noProof/>
+          <w:lang w:val="en-US"/>
+        </w:rPr>
+        <w:drawing>
+          <wp:inline distT="0" distB="0" distL="0" distR="0" wp14:anchorId="4459C854" wp14:editId="6D45C1D1">
+            <wp:extent cx="3743325" cy="1698601"/>
+            <wp:effectExtent l="0" t="0" r="0" b="0"/>
+            <wp:docPr id="1144744898" name="Рисунок 1"/>
+            <wp:cNvGraphicFramePr>
+              <a:graphicFrameLocks xmlns:a="http://schemas.openxmlformats.org/drawingml/2006/main" noChangeAspect="1"/>
+            </wp:cNvGraphicFramePr>
+            <a:graphic xmlns:a="http://schemas.openxmlformats.org/drawingml/2006/main">
+              <a:graphicData uri="http://schemas.openxmlformats.org/drawingml/2006/picture">
+                <pic:pic xmlns:pic="http://schemas.openxmlformats.org/drawingml/2006/picture">
+                  <pic:nvPicPr>
+                    <pic:cNvPr id="1144744898" name=""/>
+                    <pic:cNvPicPr/>
+                  </pic:nvPicPr>
+                  <pic:blipFill>
+                    <a:blip r:embed="rId19"/>
+                    <a:stretch>
+                      <a:fillRect/>
+                    </a:stretch>
+                  </pic:blipFill>
+                  <pic:spPr>
+                    <a:xfrm>
+                      <a:off x="0" y="0"/>
+                      <a:ext cx="3765126" cy="1708494"/>
+                    </a:xfrm>
+                    <a:prstGeom prst="rect">
+                      <a:avLst/>
+                    </a:prstGeom>
+                  </pic:spPr>
+                </pic:pic>
+              </a:graphicData>
+            </a:graphic>
+          </wp:inline>
+        </w:drawing>
+      </w:r>
+    </w:p>
+    <w:p>
+      <w:pPr>
+        <w:spacing w:after="0" w:line="240" w:lineRule="auto"/>
+        <w:rPr>
+          <w:rFonts w:ascii="Times New Roman" w:hAnsi="Times New Roman" w:cs="Times New Roman"/>
           <w:lang w:val="en-US"/>
         </w:rPr>
       </w:pPr>
@@ -691,6 +1326,7 @@
       <w:r>
         <w:rPr>
           <w:rFonts w:ascii="Times New Roman" w:hAnsi="Times New Roman" w:cs="Times New Roman"/>
+          <w:noProof/>
           <w:lang w:val="ru-RU"/>
         </w:rPr>
         <w:drawing>
@@ -709,7 +1345,7 @@
                     <pic:cNvPicPr/>
                   </pic:nvPicPr>
                   <pic:blipFill rotWithShape="1">
-                    <a:blip r:embed="rId8"/>
+                    <a:blip r:embed="rId20"/>
                     <a:srcRect t="3034" b="2899"/>
                     <a:stretch>
                       <a:fillRect/>
@@ -744,7 +1380,180 @@
         <w:spacing w:after="0" w:line="240" w:lineRule="auto"/>
         <w:rPr>
           <w:rFonts w:ascii="Times New Roman" w:hAnsi="Times New Roman" w:cs="Times New Roman"/>
-          <w:lang w:val="en-US"/>
+          <w:lang w:val="ru-RU"/>
+        </w:rPr>
+      </w:pPr>
+    </w:p>
+    <w:p>
+      <w:pPr>
+        <w:spacing w:after="0" w:line="240" w:lineRule="auto"/>
+        <w:rPr>
+          <w:rFonts w:ascii="Times New Roman" w:hAnsi="Times New Roman" w:cs="Times New Roman"/>
+          <w:lang w:val="en-US"/>
+        </w:rPr>
+      </w:pPr>
+      <w:r>
+        <w:rPr>
+          <w:rFonts w:ascii="Times New Roman" w:hAnsi="Times New Roman" w:cs="Times New Roman"/>
+          <w:noProof/>
+          <w:lang w:val="ru-RU"/>
+        </w:rPr>
+        <w:lastRenderedPageBreak/>
+        <w:drawing>
+          <wp:inline distT="0" distB="0" distL="0" distR="0" wp14:anchorId="23EE3C9E" wp14:editId="7623CE01">
+            <wp:extent cx="5940425" cy="5506085"/>
+            <wp:effectExtent l="0" t="0" r="3175" b="0"/>
+            <wp:docPr id="1766372516" name="Рисунок 1"/>
+            <wp:cNvGraphicFramePr>
+              <a:graphicFrameLocks xmlns:a="http://schemas.openxmlformats.org/drawingml/2006/main" noChangeAspect="1"/>
+            </wp:cNvGraphicFramePr>
+            <a:graphic xmlns:a="http://schemas.openxmlformats.org/drawingml/2006/main">
+              <a:graphicData uri="http://schemas.openxmlformats.org/drawingml/2006/picture">
+                <pic:pic xmlns:pic="http://schemas.openxmlformats.org/drawingml/2006/picture">
+                  <pic:nvPicPr>
+                    <pic:cNvPr id="1766372516" name=""/>
+                    <pic:cNvPicPr/>
+                  </pic:nvPicPr>
+                  <pic:blipFill>
+                    <a:blip r:embed="rId21"/>
+                    <a:stretch>
+                      <a:fillRect/>
+                    </a:stretch>
+                  </pic:blipFill>
+                  <pic:spPr>
+                    <a:xfrm>
+                      <a:off x="0" y="0"/>
+                      <a:ext cx="5940425" cy="5506085"/>
+                    </a:xfrm>
+                    <a:prstGeom prst="rect">
+                      <a:avLst/>
+                    </a:prstGeom>
+                  </pic:spPr>
+                </pic:pic>
+              </a:graphicData>
+            </a:graphic>
+          </wp:inline>
+        </w:drawing>
+      </w:r>
+    </w:p>
+    <w:p>
+      <w:pPr>
+        <w:spacing w:after="0" w:line="240" w:lineRule="auto"/>
+        <w:rPr>
+          <w:rFonts w:ascii="Times New Roman" w:hAnsi="Times New Roman" w:cs="Times New Roman"/>
+          <w:lang w:val="en-US"/>
+        </w:rPr>
+      </w:pPr>
+      <w:r>
+        <w:rPr>
+          <w:rFonts w:ascii="Times New Roman" w:hAnsi="Times New Roman" w:cs="Times New Roman"/>
+          <w:noProof/>
+          <w:lang w:val="ru-RU"/>
+        </w:rPr>
+        <w:lastRenderedPageBreak/>
+        <w:drawing>
+          <wp:inline distT="0" distB="0" distL="0" distR="0" wp14:anchorId="2EA439D6" wp14:editId="62E46ACE">
+            <wp:extent cx="5940425" cy="4684395"/>
+            <wp:effectExtent l="0" t="0" r="3175" b="1905"/>
+            <wp:docPr id="366975151" name="Рисунок 1"/>
+            <wp:cNvGraphicFramePr>
+              <a:graphicFrameLocks xmlns:a="http://schemas.openxmlformats.org/drawingml/2006/main" noChangeAspect="1"/>
+            </wp:cNvGraphicFramePr>
+            <a:graphic xmlns:a="http://schemas.openxmlformats.org/drawingml/2006/main">
+              <a:graphicData uri="http://schemas.openxmlformats.org/drawingml/2006/picture">
+                <pic:pic xmlns:pic="http://schemas.openxmlformats.org/drawingml/2006/picture">
+                  <pic:nvPicPr>
+                    <pic:cNvPr id="366975151" name=""/>
+                    <pic:cNvPicPr/>
+                  </pic:nvPicPr>
+                  <pic:blipFill>
+                    <a:blip r:embed="rId22"/>
+                    <a:stretch>
+                      <a:fillRect/>
+                    </a:stretch>
+                  </pic:blipFill>
+                  <pic:spPr>
+                    <a:xfrm>
+                      <a:off x="0" y="0"/>
+                      <a:ext cx="5940425" cy="4684395"/>
+                    </a:xfrm>
+                    <a:prstGeom prst="rect">
+                      <a:avLst/>
+                    </a:prstGeom>
+                  </pic:spPr>
+                </pic:pic>
+              </a:graphicData>
+            </a:graphic>
+          </wp:inline>
+        </w:drawing>
+      </w:r>
+    </w:p>
+    <w:p>
+      <w:pPr>
+        <w:spacing w:after="0" w:line="240" w:lineRule="auto"/>
+        <w:rPr>
+          <w:rFonts w:ascii="Times New Roman" w:hAnsi="Times New Roman" w:cs="Times New Roman"/>
+          <w:lang w:val="en-US"/>
+        </w:rPr>
+      </w:pPr>
+    </w:p>
+    <w:p>
+      <w:pPr>
+        <w:spacing w:after="0" w:line="240" w:lineRule="auto"/>
+        <w:rPr>
+          <w:rFonts w:ascii="Times New Roman" w:hAnsi="Times New Roman" w:cs="Times New Roman"/>
+          <w:lang w:val="en-US"/>
+        </w:rPr>
+      </w:pPr>
+      <w:r>
+        <w:rPr>
+          <w:rFonts w:ascii="Times New Roman" w:hAnsi="Times New Roman" w:cs="Times New Roman"/>
+          <w:noProof/>
+          <w:lang w:val="en-US"/>
+        </w:rPr>
+        <w:drawing>
+          <wp:inline distT="0" distB="0" distL="0" distR="0" wp14:anchorId="17EA26E3" wp14:editId="6121ABE9">
+            <wp:extent cx="5940425" cy="1894840"/>
+            <wp:effectExtent l="0" t="0" r="3175" b="0"/>
+            <wp:docPr id="439446154" name="Рисунок 1"/>
+            <wp:cNvGraphicFramePr>
+              <a:graphicFrameLocks xmlns:a="http://schemas.openxmlformats.org/drawingml/2006/main" noChangeAspect="1"/>
+            </wp:cNvGraphicFramePr>
+            <a:graphic xmlns:a="http://schemas.openxmlformats.org/drawingml/2006/main">
+              <a:graphicData uri="http://schemas.openxmlformats.org/drawingml/2006/picture">
+                <pic:pic xmlns:pic="http://schemas.openxmlformats.org/drawingml/2006/picture">
+                  <pic:nvPicPr>
+                    <pic:cNvPr id="439446154" name=""/>
+                    <pic:cNvPicPr/>
+                  </pic:nvPicPr>
+                  <pic:blipFill>
+                    <a:blip r:embed="rId23"/>
+                    <a:stretch>
+                      <a:fillRect/>
+                    </a:stretch>
+                  </pic:blipFill>
+                  <pic:spPr>
+                    <a:xfrm>
+                      <a:off x="0" y="0"/>
+                      <a:ext cx="5940425" cy="1894840"/>
+                    </a:xfrm>
+                    <a:prstGeom prst="rect">
+                      <a:avLst/>
+                    </a:prstGeom>
+                  </pic:spPr>
+                </pic:pic>
+              </a:graphicData>
+            </a:graphic>
+          </wp:inline>
+        </w:drawing>
+      </w:r>
+    </w:p>
+    <w:p>
+      <w:pPr>
+        <w:spacing w:after="0" w:line="240" w:lineRule="auto"/>
+        <w:rPr>
+          <w:rFonts w:ascii="Times New Roman" w:hAnsi="Times New Roman" w:cs="Times New Roman"/>
+          <w:lang w:val="ru-RU"/>
         </w:rPr>
       </w:pPr>
     </w:p>
@@ -762,7 +1571,6 @@
           <w:b/>
           <w:lang w:val="ru-RU"/>
         </w:rPr>
-        <w:lastRenderedPageBreak/>
         <w:t xml:space="preserve">Задание 5. </w:t>
       </w:r>
       <w:r>
@@ -848,12 +1656,13 @@
       <w:r>
         <w:rPr>
           <w:rFonts w:ascii="Times New Roman" w:hAnsi="Times New Roman" w:cs="Times New Roman"/>
+          <w:noProof/>
           <w:lang w:val="en-US"/>
         </w:rPr>
         <w:drawing>
-          <wp:inline distT="0" distB="0" distL="0" distR="0" wp14:anchorId="4F53FA38" wp14:editId="273C6658">
-            <wp:extent cx="5940425" cy="347662"/>
-            <wp:effectExtent l="0" t="0" r="3175" b="0"/>
+          <wp:inline distT="0" distB="0" distL="0" distR="0" wp14:anchorId="4F53FA38" wp14:editId="1FFFF8C8">
+            <wp:extent cx="5935008" cy="347345"/>
+            <wp:effectExtent l="0" t="0" r="8890" b="0"/>
             <wp:docPr id="393987612" name="Рисунок 1"/>
             <wp:cNvGraphicFramePr>
               <a:graphicFrameLocks xmlns:a="http://schemas.openxmlformats.org/drawingml/2006/main" noChangeAspect="1"/>
@@ -866,7 +1675,7 @@
                     <pic:cNvPicPr/>
                   </pic:nvPicPr>
                   <pic:blipFill rotWithShape="1">
-                    <a:blip r:embed="rId9"/>
+                    <a:blip r:embed="rId24"/>
                     <a:srcRect t="9479" b="4028"/>
                     <a:stretch>
                       <a:fillRect/>
@@ -896,6 +1705,269 @@
         </w:drawing>
       </w:r>
     </w:p>
+    <w:p>
+      <w:pPr>
+        <w:spacing w:after="0" w:line="240" w:lineRule="auto"/>
+        <w:rPr>
+          <w:rFonts w:ascii="Times New Roman" w:hAnsi="Times New Roman" w:cs="Times New Roman"/>
+          <w:lang w:val="en-US"/>
+        </w:rPr>
+      </w:pPr>
+      <w:r>
+        <w:rPr>
+          <w:rFonts w:ascii="Times New Roman" w:hAnsi="Times New Roman" w:cs="Times New Roman"/>
+          <w:noProof/>
+          <w:lang w:val="ru-RU"/>
+        </w:rPr>
+        <w:lastRenderedPageBreak/>
+        <w:drawing>
+          <wp:inline distT="0" distB="0" distL="0" distR="0" wp14:anchorId="69520D73" wp14:editId="7CF33BAB">
+            <wp:extent cx="5940425" cy="6143625"/>
+            <wp:effectExtent l="0" t="0" r="3175" b="9525"/>
+            <wp:docPr id="267370720" name="Рисунок 1"/>
+            <wp:cNvGraphicFramePr>
+              <a:graphicFrameLocks xmlns:a="http://schemas.openxmlformats.org/drawingml/2006/main" noChangeAspect="1"/>
+            </wp:cNvGraphicFramePr>
+            <a:graphic xmlns:a="http://schemas.openxmlformats.org/drawingml/2006/main">
+              <a:graphicData uri="http://schemas.openxmlformats.org/drawingml/2006/picture">
+                <pic:pic xmlns:pic="http://schemas.openxmlformats.org/drawingml/2006/picture">
+                  <pic:nvPicPr>
+                    <pic:cNvPr id="267370720" name=""/>
+                    <pic:cNvPicPr/>
+                  </pic:nvPicPr>
+                  <pic:blipFill>
+                    <a:blip r:embed="rId25"/>
+                    <a:stretch>
+                      <a:fillRect/>
+                    </a:stretch>
+                  </pic:blipFill>
+                  <pic:spPr>
+                    <a:xfrm>
+                      <a:off x="0" y="0"/>
+                      <a:ext cx="5940425" cy="6143625"/>
+                    </a:xfrm>
+                    <a:prstGeom prst="rect">
+                      <a:avLst/>
+                    </a:prstGeom>
+                  </pic:spPr>
+                </pic:pic>
+              </a:graphicData>
+            </a:graphic>
+          </wp:inline>
+        </w:drawing>
+      </w:r>
+    </w:p>
+    <w:p>
+      <w:pPr>
+        <w:spacing w:after="0" w:line="240" w:lineRule="auto"/>
+        <w:rPr>
+          <w:rFonts w:ascii="Times New Roman" w:hAnsi="Times New Roman" w:cs="Times New Roman"/>
+          <w:lang w:val="en-US"/>
+        </w:rPr>
+      </w:pPr>
+    </w:p>
+    <w:p>
+      <w:pPr>
+        <w:spacing w:after="0" w:line="240" w:lineRule="auto"/>
+        <w:rPr>
+          <w:rFonts w:ascii="Times New Roman" w:hAnsi="Times New Roman" w:cs="Times New Roman"/>
+          <w:lang w:val="en-US"/>
+        </w:rPr>
+      </w:pPr>
+      <w:r>
+        <w:rPr>
+          <w:rFonts w:ascii="Times New Roman" w:hAnsi="Times New Roman" w:cs="Times New Roman"/>
+          <w:noProof/>
+          <w:lang w:val="ru-RU"/>
+        </w:rPr>
+        <w:lastRenderedPageBreak/>
+        <w:drawing>
+          <wp:inline distT="0" distB="0" distL="0" distR="0" wp14:anchorId="22B12989" wp14:editId="4D5B95B4">
+            <wp:extent cx="5940425" cy="3344545"/>
+            <wp:effectExtent l="0" t="0" r="3175" b="8255"/>
+            <wp:docPr id="1744628150" name="Рисунок 1"/>
+            <wp:cNvGraphicFramePr>
+              <a:graphicFrameLocks xmlns:a="http://schemas.openxmlformats.org/drawingml/2006/main" noChangeAspect="1"/>
+            </wp:cNvGraphicFramePr>
+            <a:graphic xmlns:a="http://schemas.openxmlformats.org/drawingml/2006/main">
+              <a:graphicData uri="http://schemas.openxmlformats.org/drawingml/2006/picture">
+                <pic:pic xmlns:pic="http://schemas.openxmlformats.org/drawingml/2006/picture">
+                  <pic:nvPicPr>
+                    <pic:cNvPr id="1744628150" name=""/>
+                    <pic:cNvPicPr/>
+                  </pic:nvPicPr>
+                  <pic:blipFill>
+                    <a:blip r:embed="rId26"/>
+                    <a:stretch>
+                      <a:fillRect/>
+                    </a:stretch>
+                  </pic:blipFill>
+                  <pic:spPr>
+                    <a:xfrm>
+                      <a:off x="0" y="0"/>
+                      <a:ext cx="5940425" cy="3344545"/>
+                    </a:xfrm>
+                    <a:prstGeom prst="rect">
+                      <a:avLst/>
+                    </a:prstGeom>
+                  </pic:spPr>
+                </pic:pic>
+              </a:graphicData>
+            </a:graphic>
+          </wp:inline>
+        </w:drawing>
+      </w:r>
+    </w:p>
+    <w:p>
+      <w:pPr>
+        <w:spacing w:after="0" w:line="240" w:lineRule="auto"/>
+        <w:rPr>
+          <w:rFonts w:ascii="Times New Roman" w:hAnsi="Times New Roman" w:cs="Times New Roman"/>
+          <w:lang w:val="en-US"/>
+        </w:rPr>
+      </w:pPr>
+    </w:p>
+    <w:p>
+      <w:pPr>
+        <w:spacing w:after="0" w:line="240" w:lineRule="auto"/>
+        <w:rPr>
+          <w:rFonts w:ascii="Times New Roman" w:hAnsi="Times New Roman" w:cs="Times New Roman"/>
+          <w:lang w:val="en-US"/>
+        </w:rPr>
+      </w:pPr>
+      <w:r>
+        <w:rPr>
+          <w:rFonts w:ascii="Times New Roman" w:hAnsi="Times New Roman" w:cs="Times New Roman"/>
+          <w:noProof/>
+          <w:lang w:val="ru-RU"/>
+        </w:rPr>
+        <w:drawing>
+          <wp:inline distT="0" distB="0" distL="0" distR="0" wp14:anchorId="2239FAAA" wp14:editId="06E0E323">
+            <wp:extent cx="5940425" cy="4439920"/>
+            <wp:effectExtent l="0" t="0" r="3175" b="0"/>
+            <wp:docPr id="1232651870" name="Рисунок 1"/>
+            <wp:cNvGraphicFramePr>
+              <a:graphicFrameLocks xmlns:a="http://schemas.openxmlformats.org/drawingml/2006/main" noChangeAspect="1"/>
+            </wp:cNvGraphicFramePr>
+            <a:graphic xmlns:a="http://schemas.openxmlformats.org/drawingml/2006/main">
+              <a:graphicData uri="http://schemas.openxmlformats.org/drawingml/2006/picture">
+                <pic:pic xmlns:pic="http://schemas.openxmlformats.org/drawingml/2006/picture">
+                  <pic:nvPicPr>
+                    <pic:cNvPr id="1232651870" name=""/>
+                    <pic:cNvPicPr/>
+                  </pic:nvPicPr>
+                  <pic:blipFill>
+                    <a:blip r:embed="rId27"/>
+                    <a:stretch>
+                      <a:fillRect/>
+                    </a:stretch>
+                  </pic:blipFill>
+                  <pic:spPr>
+                    <a:xfrm>
+                      <a:off x="0" y="0"/>
+                      <a:ext cx="5940425" cy="4439920"/>
+                    </a:xfrm>
+                    <a:prstGeom prst="rect">
+                      <a:avLst/>
+                    </a:prstGeom>
+                  </pic:spPr>
+                </pic:pic>
+              </a:graphicData>
+            </a:graphic>
+          </wp:inline>
+        </w:drawing>
+      </w:r>
+    </w:p>
+    <w:p>
+      <w:pPr>
+        <w:spacing w:after="0" w:line="240" w:lineRule="auto"/>
+        <w:rPr>
+          <w:rFonts w:ascii="Times New Roman" w:hAnsi="Times New Roman" w:cs="Times New Roman"/>
+          <w:lang w:val="en-US"/>
+        </w:rPr>
+      </w:pPr>
+      <w:r>
+        <w:rPr>
+          <w:rFonts w:ascii="Times New Roman" w:hAnsi="Times New Roman" w:cs="Times New Roman"/>
+          <w:noProof/>
+          <w:lang w:val="en-US"/>
+        </w:rPr>
+        <w:lastRenderedPageBreak/>
+        <w:drawing>
+          <wp:inline distT="0" distB="0" distL="0" distR="0" wp14:anchorId="183BE505" wp14:editId="490E0B89">
+            <wp:extent cx="5940425" cy="5139055"/>
+            <wp:effectExtent l="0" t="0" r="3175" b="4445"/>
+            <wp:docPr id="1031163392" name="Рисунок 1"/>
+            <wp:cNvGraphicFramePr>
+              <a:graphicFrameLocks xmlns:a="http://schemas.openxmlformats.org/drawingml/2006/main" noChangeAspect="1"/>
+            </wp:cNvGraphicFramePr>
+            <a:graphic xmlns:a="http://schemas.openxmlformats.org/drawingml/2006/main">
+              <a:graphicData uri="http://schemas.openxmlformats.org/drawingml/2006/picture">
+                <pic:pic xmlns:pic="http://schemas.openxmlformats.org/drawingml/2006/picture">
+                  <pic:nvPicPr>
+                    <pic:cNvPr id="1031163392" name=""/>
+                    <pic:cNvPicPr/>
+                  </pic:nvPicPr>
+                  <pic:blipFill>
+                    <a:blip r:embed="rId28"/>
+                    <a:stretch>
+                      <a:fillRect/>
+                    </a:stretch>
+                  </pic:blipFill>
+                  <pic:spPr>
+                    <a:xfrm>
+                      <a:off x="0" y="0"/>
+                      <a:ext cx="5940425" cy="5139055"/>
+                    </a:xfrm>
+                    <a:prstGeom prst="rect">
+                      <a:avLst/>
+                    </a:prstGeom>
+                  </pic:spPr>
+                </pic:pic>
+              </a:graphicData>
+            </a:graphic>
+          </wp:inline>
+        </w:drawing>
+      </w:r>
+    </w:p>
+    <w:p>
+      <w:pPr>
+        <w:spacing w:after="0" w:line="240" w:lineRule="auto"/>
+        <w:rPr>
+          <w:rFonts w:ascii="Times New Roman" w:hAnsi="Times New Roman" w:cs="Times New Roman"/>
+          <w:lang w:val="ru-RU"/>
+        </w:rPr>
+      </w:pPr>
+    </w:p>
+    <w:p>
+      <w:pPr>
+        <w:spacing w:after="0" w:line="240" w:lineRule="auto"/>
+        <w:rPr>
+          <w:rFonts w:ascii="Times New Roman" w:hAnsi="Times New Roman" w:cs="Times New Roman"/>
+          <w:lang w:val="ru-RU"/>
+        </w:rPr>
+      </w:pPr>
+    </w:p>
+    <w:p>
+      <w:pPr>
+        <w:spacing w:after="0" w:line="240" w:lineRule="auto"/>
+        <w:jc w:val="center"/>
+        <w:rPr>
+          <w:rFonts w:ascii="Times New Roman" w:hAnsi="Times New Roman" w:cs="Times New Roman"/>
+          <w:lang w:val="ru-RU"/>
+        </w:rPr>
+      </w:pPr>
+    </w:p>
+    <w:p>
+      <w:pPr>
+        <w:spacing w:after="0" w:line="240" w:lineRule="auto"/>
+        <w:jc w:val="center"/>
+        <w:rPr>
+          <w:rFonts w:ascii="Times New Roman" w:hAnsi="Times New Roman" w:cs="Times New Roman"/>
+          <w:lang w:val="ru-RU"/>
+        </w:rPr>
+      </w:pPr>
+    </w:p>
     <w:sectPr>
       <w:pgSz w:w="11906" w:h="16838"/>
       <w:pgMar w:top="1134" w:right="850" w:bottom="1134" w:left="1701" w:header="708" w:footer="708" w:gutter="0"/>
@@ -904,6 +1976,127 @@
     </w:sectPr>
   </w:body>
 </w:document>
+</file>
+
+<file path=word/numbering.xml><?xml version="1.0" encoding="utf-8"?>
+<w:numbering xmlns:wpc="http://schemas.microsoft.com/office/word/2010/wordprocessingCanvas" xmlns:cx="http://schemas.microsoft.com/office/drawing/2014/chartex" xmlns:cx1="http://schemas.microsoft.com/office/drawing/2015/9/8/chartex" xmlns:cx2="http://schemas.microsoft.com/office/drawing/2015/10/21/chartex" xmlns:cx3="http://schemas.microsoft.com/office/drawing/2016/5/9/chartex" xmlns:cx4="http://schemas.microsoft.com/office/drawing/2016/5/10/chartex" xmlns:cx5="http://schemas.microsoft.com/office/drawing/2016/5/11/chartex" xmlns:cx6="http://schemas.microsoft.com/office/drawing/2016/5/12/chartex" xmlns:cx7="http://schemas.microsoft.com/office/drawing/2016/5/13/chartex" xmlns:cx8="http://schemas.microsoft.com/office/drawing/2016/5/14/chartex" xmlns:mc="http://schemas.openxmlformats.org/markup-compatibility/2006" xmlns:aink="http://schemas.microsoft.com/office/drawing/2016/ink" xmlns:am3d="http://schemas.microsoft.com/office/drawing/2017/model3d" xmlns:o="urn:schemas-microsoft-com:office:office" xmlns:oel="http://schemas.microsoft.com/office/2019/extlst" xmlns:r="http://schemas.openxmlformats.org/officeDocument/2006/relationships" xmlns:m="http://schemas.openxmlformats.org/officeDocument/2006/math" xmlns:v="urn:schemas-microsoft-com:vml" xmlns:wp14="http://schemas.microsoft.com/office/word/2010/wordprocessingDrawing" xmlns:wp="http://schemas.openxmlformats.org/drawingml/2006/wordprocessingDrawing" xmlns:w10="urn:schemas-microsoft-com:office:word" xmlns:w="http://schemas.openxmlformats.org/wordprocessingml/2006/main" xmlns:w14="http://schemas.microsoft.com/office/word/2010/wordml" xmlns:w15="http://schemas.microsoft.com/office/word/2012/wordml" xmlns:w16cex="http://schemas.microsoft.com/office/word/2018/wordml/cex" xmlns:w16cid="http://schemas.microsoft.com/office/word/2016/wordml/cid" xmlns:w16="http://schemas.microsoft.com/office/word/2018/wordml" xmlns:w16du="http://schemas.microsoft.com/office/word/2023/wordml/word16du" xmlns:w16sdtdh="http://schemas.microsoft.com/office/word/2020/wordml/sdtdatahash" xmlns:w16sdtfl="http://schemas.microsoft.com/office/word/2024/wordml/sdtformatlock" xmlns:w16se="http://schemas.microsoft.com/office/word/2015/wordml/symex" xmlns:wpg="http://schemas.microsoft.com/office/word/2010/wordprocessingGroup" xmlns:wpi="http://schemas.microsoft.com/office/word/2010/wordprocessingInk" xmlns:wne="http://schemas.microsoft.com/office/word/2006/wordml" xmlns:wps="http://schemas.microsoft.com/office/word/2010/wordprocessingShape" mc:Ignorable="w14 w15 w16se w16cid w16 w16cex w16sdtdh w16sdtfl w16du wp14">
+  <w:abstractNum w:abstractNumId="0" w15:restartNumberingAfterBreak="0">
+    <w:nsid w:val="545329D5"/>
+    <w:multiLevelType w:val="hybridMultilevel"/>
+    <w:tmpl w:val="01764EF6"/>
+    <w:lvl w:ilvl="0" w:tplc="9E34AD7C">
+      <w:start w:val="1"/>
+      <w:numFmt w:val="decimal"/>
+      <w:lvlText w:val="%1."/>
+      <w:lvlJc w:val="left"/>
+      <w:pPr>
+        <w:ind w:left="720" w:hanging="360"/>
+      </w:pPr>
+    </w:lvl>
+    <w:lvl w:ilvl="1" w:tplc="04190019">
+      <w:start w:val="1"/>
+      <w:numFmt w:val="lowerLetter"/>
+      <w:lvlText w:val="%2."/>
+      <w:lvlJc w:val="left"/>
+      <w:pPr>
+        <w:ind w:left="1440" w:hanging="360"/>
+      </w:pPr>
+    </w:lvl>
+    <w:lvl w:ilvl="2" w:tplc="0419001B">
+      <w:start w:val="1"/>
+      <w:numFmt w:val="lowerRoman"/>
+      <w:lvlText w:val="%3."/>
+      <w:lvlJc w:val="right"/>
+      <w:pPr>
+        <w:ind w:left="2160" w:hanging="180"/>
+      </w:pPr>
+    </w:lvl>
+    <w:lvl w:ilvl="3" w:tplc="0419000F">
+      <w:start w:val="1"/>
+      <w:numFmt w:val="decimal"/>
+      <w:lvlText w:val="%4."/>
+      <w:lvlJc w:val="left"/>
+      <w:pPr>
+        <w:ind w:left="2880" w:hanging="360"/>
+      </w:pPr>
+    </w:lvl>
+    <w:lvl w:ilvl="4" w:tplc="04190019">
+      <w:start w:val="1"/>
+      <w:numFmt w:val="lowerLetter"/>
+      <w:lvlText w:val="%5."/>
+      <w:lvlJc w:val="left"/>
+      <w:pPr>
+        <w:ind w:left="3600" w:hanging="360"/>
+      </w:pPr>
+    </w:lvl>
+    <w:lvl w:ilvl="5" w:tplc="0419001B">
+      <w:start w:val="1"/>
+      <w:numFmt w:val="lowerRoman"/>
+      <w:lvlText w:val="%6."/>
+      <w:lvlJc w:val="right"/>
+      <w:pPr>
+        <w:ind w:left="4320" w:hanging="180"/>
+      </w:pPr>
+    </w:lvl>
+    <w:lvl w:ilvl="6" w:tplc="0419000F">
+      <w:start w:val="1"/>
+      <w:numFmt w:val="decimal"/>
+      <w:lvlText w:val="%7."/>
+      <w:lvlJc w:val="left"/>
+      <w:pPr>
+        <w:ind w:left="5040" w:hanging="360"/>
+      </w:pPr>
+    </w:lvl>
+    <w:lvl w:ilvl="7" w:tplc="04190019">
+      <w:start w:val="1"/>
+      <w:numFmt w:val="lowerLetter"/>
+      <w:lvlText w:val="%8."/>
+      <w:lvlJc w:val="left"/>
+      <w:pPr>
+        <w:ind w:left="5760" w:hanging="360"/>
+      </w:pPr>
+    </w:lvl>
+    <w:lvl w:ilvl="8" w:tplc="0419001B">
+      <w:start w:val="1"/>
+      <w:numFmt w:val="lowerRoman"/>
+      <w:lvlText w:val="%9."/>
+      <w:lvlJc w:val="right"/>
+      <w:pPr>
+        <w:ind w:left="6480" w:hanging="180"/>
+      </w:pPr>
+    </w:lvl>
+  </w:abstractNum>
+  <w:num w:numId="1" w16cid:durableId="613171115">
+    <w:abstractNumId w:val="0"/>
+    <w:lvlOverride w:ilvl="0">
+      <w:startOverride w:val="1"/>
+    </w:lvlOverride>
+    <w:lvlOverride w:ilvl="1">
+      <w:startOverride w:val="1"/>
+    </w:lvlOverride>
+    <w:lvlOverride w:ilvl="2">
+      <w:startOverride w:val="1"/>
+    </w:lvlOverride>
+    <w:lvlOverride w:ilvl="3">
+      <w:startOverride w:val="1"/>
+    </w:lvlOverride>
+    <w:lvlOverride w:ilvl="4">
+      <w:startOverride w:val="1"/>
+    </w:lvlOverride>
+    <w:lvlOverride w:ilvl="5">
+      <w:startOverride w:val="1"/>
+    </w:lvlOverride>
+    <w:lvlOverride w:ilvl="6">
+      <w:startOverride w:val="1"/>
+    </w:lvlOverride>
+    <w:lvlOverride w:ilvl="7">
+      <w:startOverride w:val="1"/>
+    </w:lvlOverride>
+    <w:lvlOverride w:ilvl="8">
+      <w:startOverride w:val="1"/>
+    </w:lvlOverride>
+  </w:num>
+</w:numbering>
 </file>
 
 <file path=word/styles.xml><?xml version="1.0" encoding="utf-8"?>

</xml_diff>